<commit_message>
Charge commission on quote winners; price the calculator from live fee rules
- Accepting a multi-candidate quote winner without re-typing the price now
  keeps the winning bid and stamps the platform fee on it. Before, the accept
  wiped the bid and charged no fee (fee-rules.md §4 known gap).
- The homepage take-rate calculator prices each job through the fee engine
  with the rule set and plan prices in force ($5 floor included), instead of
  a hard-coded 9/7/5/4% ladder the shipped defaults do not charge. Only the
  take-rate layers of the rule set are passed to the client.
- Docs and the revenue test guide now show current prices ($15–$199, current
  plan names, real credit packs) and state that the 12/9/7/5/4% ladder is a
  preset; the shipped default is 7%, Business 4%.

Co-Authored-By: Claude Opus 5.5 <noreply@anthropic.com>
</commit_message>
<xml_diff>
--- a/docs/WorkersArena-Revenue-Test-Guide.docx
+++ b/docs/WorkersArena-Revenue-Test-Guide.docx
@@ -77,7 +77,7 @@
           <w:sz w:val="18"/>
           <w:szCs w:val="18"/>
         </w:rPr>
-        <w:t xml:space="preserve">Generated 2026-09-15</w:t>
+        <w:t xml:space="preserve">Generated 2026-09-28</w:t>
       </w:r>
     </w:p>
     <w:p>
@@ -1034,7 +1034,7 @@
           <w:sz w:val="22"/>
           <w:szCs w:val="22"/>
         </w:rPr>
-        <w:t xml:space="preserve">Worker (Khaled): slug khaled-al-harbi-plumbing — has Professional plan</w:t>
+        <w:t xml:space="preserve">Worker (Khaled): slug khaled-al-harbi-plumbing — has the Growth plan (enum: professional)</w:t>
       </w:r>
     </w:p>
     <w:p>
@@ -1052,7 +1052,7 @@
           <w:sz w:val="22"/>
           <w:szCs w:val="22"/>
         </w:rPr>
-        <w:t xml:space="preserve">Worker (Sara): slug sara-mansour-electrical — has Premium plan</w:t>
+        <w:t xml:space="preserve">Worker (Sara): slug sara-mansour-electrical — has the Pro plan (enum: premium)</w:t>
       </w:r>
     </w:p>
     <w:p>
@@ -1107,7 +1107,7 @@
           <w:sz w:val="22"/>
           <w:szCs w:val="22"/>
         </w:rPr>
-        <w:t xml:space="preserve">Workers pay $29–$299/month for a subscription plan that gates visibility and features.</w:t>
+        <w:t xml:space="preserve">Workers pay $15–$199/month (base price; cleaning-type trades pay 0.5×, HVAC-type trades 1.5×) for a subscription plan that gates visibility and features. Annual billing charges 9 months for 12.</w:t>
       </w:r>
     </w:p>
     <w:p>
@@ -1243,7 +1243,7 @@
           <w:sz w:val="22"/>
           <w:szCs w:val="22"/>
         </w:rPr>
-        <w:t xml:space="preserve">The dialog shows plan options: Basic $29, Professional $59, Premium $119, Enterprise $299.</w:t>
+        <w:t xml:space="preserve">The dialog shows plan options: Starter $15, Growth $39, Pro $99, Business $199 (plumbing is a mid-value trade, so no category adjustment).</w:t>
       </w:r>
     </w:p>
     <w:p>
@@ -1687,7 +1687,7 @@
           <w:sz w:val="22"/>
           <w:szCs w:val="22"/>
         </w:rPr>
-        <w:t xml:space="preserve">The platform charges 7% (700 bps) of the job quote as a fee, with a $5 floor and $300 cap. Enterprise plan is exempt.</w:t>
+        <w:t xml:space="preserve">The shipped default rule set charges 7% on every plan and a reduced 4% for Business, with a $5 floor and $300 cap. The 12/9/7/5/4% ladder (Free, Starter, Growth, Pro, Business) applies only after an admin publishes it from /admin/revenue-settings. A full exemption applies only when explicitly configured in the active rule set.</w:t>
       </w:r>
     </w:p>
     <w:p>
@@ -1980,30 +1980,30 @@
           <w:sz w:val="22"/>
           <w:szCs w:val="22"/>
         </w:rPr>
-        <w:t xml:space="preserve">Create a booking with an Enterprise worker → fee = $0 (exempt).</w:t>
-      </w:r>
-    </w:p>
-    <w:p>
-      <w:pPr>
-        <w:spacing w:after="60" w:line="290"/>
-        <w:ind w:left="260" w:hanging="260"/>
-      </w:pPr>
-      <w:r>
-        <w:rPr>
-          <w:sz w:val="22"/>
-          <w:szCs w:val="22"/>
-        </w:rPr>
-        <w:t xml:space="preserve">✅ </w:t>
-      </w:r>
-      <w:r>
-        <w:rPr>
-          <w:b/>
-          <w:bCs/>
-          <w:color w:val="059669"/>
-          <w:sz w:val="22"/>
-          <w:szCs w:val="22"/>
-        </w:rPr>
-        <w:t xml:space="preserve">Each fee matches the expected floor/cap/exempt value.</w:t>
+        <w:t xml:space="preserve">Create a booking with a Business worker → fee uses the configured 4% reduced rate; test a separately configured exempt rule to verify a $0 fee.</w:t>
+      </w:r>
+    </w:p>
+    <w:p>
+      <w:pPr>
+        <w:spacing w:after="60" w:line="290"/>
+        <w:ind w:left="260" w:hanging="260"/>
+      </w:pPr>
+      <w:r>
+        <w:rPr>
+          <w:sz w:val="22"/>
+          <w:szCs w:val="22"/>
+        </w:rPr>
+        <w:t xml:space="preserve">✅ </w:t>
+      </w:r>
+      <w:r>
+        <w:rPr>
+          <w:b/>
+          <w:bCs/>
+          <w:color w:val="059669"/>
+          <w:sz w:val="22"/>
+          <w:szCs w:val="22"/>
+        </w:rPr>
+        <w:t xml:space="preserve">Each fee matches the expected plan/category/promotion rate, floor/cap, or explicitly configured exemption.</w:t>
       </w:r>
     </w:p>
     <w:p>
@@ -3505,7 +3505,7 @@
           <w:sz w:val="22"/>
           <w:szCs w:val="22"/>
         </w:rPr>
-        <w:t xml:space="preserve">The page shows available packages (e.g. Starter 10 credits $10, Pro 25 credits $20, Bulk 100 credits $70).</w:t>
+        <w:t xml:space="preserve">The page shows the packages: Starter 10 credits $10, Popular 25 + 5 bonus $25, Professional 50 + 15 bonus $50, Enterprise 100 + 30 bonus $100.</w:t>
       </w:r>
     </w:p>
     <w:p>
@@ -7810,7 +7810,7 @@
                 <w:sz w:val="19"/>
                 <w:szCs w:val="19"/>
               </w:rPr>
-              <w:t xml:space="preserve">Recurring ($29–$299/mo)</w:t>
+              <w:t xml:space="preserve">Recurring ($15–$199/mo)</w:t>
             </w:r>
           </w:p>
         </w:tc>
@@ -7908,7 +7908,7 @@
                 <w:sz w:val="19"/>
                 <w:szCs w:val="19"/>
               </w:rPr>
-              <w:t xml:space="preserve">Per-booking (7%, $5–$300)</w:t>
+              <w:t xml:space="preserve">Per-booking (7%, Business 4%, $5–$300)</w:t>
             </w:r>
           </w:p>
         </w:tc>

</xml_diff>

<commit_message>
Step 4 pricing: commission ladder, Pro at $59, 50% lead refund
Pricing decisions from the revenue plan, as the shipped defaults (an
admin-published rule set in /admin/revenue-settings still overrides them):

- Commission ladder by plan: Free 12%, Starter 9%, Growth 7%, Pro 5%,
  Business 4% ($5 floor, $300 cap). The shipped default charged 7% on
  every plan but Business, so upgrading never lowered commission.
- Pro: $59/month (was $99), closing the jump from Growth ($39); with the
  ladder, Pro pays for itself above ~$1,000/month of jobs.
- Lead rebate: 50% of the fee comes back on a job from a bought lead
  (was 100%, which left the platform only the larger of lead or fee).

Tests updated to the new numbers (the demo worker is on Pro, so an $80
job's fee is 5% floored to $5). Docs, the revenue test guide and the user
manual quote the new prices; pricing-docs guard passes.

Co-Authored-By: Claude Opus 5.5 <noreply@anthropic.com>
</commit_message>
<xml_diff>
--- a/docs/WorkersArena-Revenue-Test-Guide.docx
+++ b/docs/WorkersArena-Revenue-Test-Guide.docx
@@ -1243,7 +1243,7 @@
           <w:sz w:val="22"/>
           <w:szCs w:val="22"/>
         </w:rPr>
-        <w:t xml:space="preserve">The dialog shows plan options: Starter $15, Growth $39, Pro $99, Business $199 (plumbing is a mid-value trade, so no category adjustment).</w:t>
+        <w:t xml:space="preserve">The dialog shows plan options: Starter $15, Growth $39, Pro $59, Business $199 (plumbing is a mid-value trade, so no category adjustment).</w:t>
       </w:r>
     </w:p>
     <w:p>
@@ -1687,7 +1687,7 @@
           <w:sz w:val="22"/>
           <w:szCs w:val="22"/>
         </w:rPr>
-        <w:t xml:space="preserve">The shipped default rule set charges 7% on every plan and a reduced 4% for Business, with a $5 floor and $300 cap. The 12/9/7/5/4% ladder (Free, Starter, Growth, Pro, Business) applies only after an admin publishes it from /admin/revenue-settings. A full exemption applies only when explicitly configured in the active rule set.</w:t>
+        <w:t xml:space="preserve">The shipped default rule set is the plan ladder: Free 12%, Starter 9%, Growth 7%, Pro 5%, Business 4%, with a $5 floor and $300 cap. An admin-published rule set in /admin/revenue-settings overrides it. A full exemption applies only when explicitly configured in the active rule set.</w:t>
       </w:r>
     </w:p>
     <w:p>
@@ -5115,30 +5115,30 @@
           <w:sz w:val="22"/>
           <w:szCs w:val="22"/>
         </w:rPr>
-        <w:t xml:space="preserve">The booking shows: Platform fee $21 (7% of $300) → Lead rebate $20 → Effective fee $1.</w:t>
-      </w:r>
-    </w:p>
-    <w:p>
-      <w:pPr>
-        <w:spacing w:after="60" w:line="290"/>
-        <w:ind w:left="260" w:hanging="260"/>
-      </w:pPr>
-      <w:r>
-        <w:rPr>
-          <w:sz w:val="22"/>
-          <w:szCs w:val="22"/>
-        </w:rPr>
-        <w:t xml:space="preserve">✅ </w:t>
-      </w:r>
-      <w:r>
-        <w:rPr>
-          <w:b/>
-          <w:bCs/>
-          <w:color w:val="059669"/>
-          <w:sz w:val="22"/>
-          <w:szCs w:val="22"/>
-        </w:rPr>
-        <w:t xml:space="preserve">The worker's net earnings are $299 (not $279).</w:t>
+        <w:t xml:space="preserve">The booking shows: Platform fee $21 (Growth 7% of $300) → Lead rebate $10.50 (50% of the fee) → Effective fee $10.50.</w:t>
+      </w:r>
+    </w:p>
+    <w:p>
+      <w:pPr>
+        <w:spacing w:after="60" w:line="290"/>
+        <w:ind w:left="260" w:hanging="260"/>
+      </w:pPr>
+      <w:r>
+        <w:rPr>
+          <w:sz w:val="22"/>
+          <w:szCs w:val="22"/>
+        </w:rPr>
+        <w:t xml:space="preserve">✅ </w:t>
+      </w:r>
+      <w:r>
+        <w:rPr>
+          <w:b/>
+          <w:bCs/>
+          <w:color w:val="059669"/>
+          <w:sz w:val="22"/>
+          <w:szCs w:val="22"/>
+        </w:rPr>
+        <w:t xml:space="preserve">The worker's net earnings are $289.50 (not $279).</w:t>
       </w:r>
     </w:p>
     <w:p>
@@ -5201,7 +5201,7 @@
           <w:sz w:val="22"/>
           <w:szCs w:val="22"/>
         </w:rPr>
-        <w:t xml:space="preserve">Set rebate config: enabled, pctBps=10000 (100%), maxMinor=null.</w:t>
+        <w:t xml:space="preserve">Set rebate config: enabled, pctBps=10000 (100% — the shipped default is 50%), maxMinor=null.</w:t>
       </w:r>
     </w:p>
     <w:p>
@@ -6312,53 +6312,53 @@
           <w:sz w:val="22"/>
           <w:szCs w:val="22"/>
         </w:rPr>
-        <w:t xml:space="preserve">Lead rebate applied: $20 (limited by lead cost).</w:t>
-      </w:r>
-    </w:p>
-    <w:p>
-      <w:pPr>
-        <w:spacing w:after="60" w:line="290"/>
-        <w:ind w:left="260" w:hanging="260"/>
-      </w:pPr>
-      <w:r>
-        <w:rPr>
-          <w:sz w:val="22"/>
-          <w:szCs w:val="22"/>
-        </w:rPr>
-        <w:t xml:space="preserve">✅ </w:t>
-      </w:r>
-      <w:r>
-        <w:rPr>
-          <w:b/>
-          <w:bCs/>
-          <w:color w:val="059669"/>
-          <w:sz w:val="22"/>
-          <w:szCs w:val="22"/>
-        </w:rPr>
-        <w:t xml:space="preserve">Effective fee: $1.</w:t>
-      </w:r>
-    </w:p>
-    <w:p>
-      <w:pPr>
-        <w:spacing w:after="60" w:line="290"/>
-        <w:ind w:left="260" w:hanging="260"/>
-      </w:pPr>
-      <w:r>
-        <w:rPr>
-          <w:sz w:val="22"/>
-          <w:szCs w:val="22"/>
-        </w:rPr>
-        <w:t xml:space="preserve">✅ </w:t>
-      </w:r>
-      <w:r>
-        <w:rPr>
-          <w:b/>
-          <w:bCs/>
-          <w:color w:val="059669"/>
-          <w:sz w:val="22"/>
-          <w:szCs w:val="22"/>
-        </w:rPr>
-        <w:t xml:space="preserve">Worker ledger credited: $299.</w:t>
+        <w:t xml:space="preserve">Lead rebate applied: $10.50 (50% of the $21 fee).</w:t>
+      </w:r>
+    </w:p>
+    <w:p>
+      <w:pPr>
+        <w:spacing w:after="60" w:line="290"/>
+        <w:ind w:left="260" w:hanging="260"/>
+      </w:pPr>
+      <w:r>
+        <w:rPr>
+          <w:sz w:val="22"/>
+          <w:szCs w:val="22"/>
+        </w:rPr>
+        <w:t xml:space="preserve">✅ </w:t>
+      </w:r>
+      <w:r>
+        <w:rPr>
+          <w:b/>
+          <w:bCs/>
+          <w:color w:val="059669"/>
+          <w:sz w:val="22"/>
+          <w:szCs w:val="22"/>
+        </w:rPr>
+        <w:t xml:space="preserve">Effective fee: $10.50.</w:t>
+      </w:r>
+    </w:p>
+    <w:p>
+      <w:pPr>
+        <w:spacing w:after="60" w:line="290"/>
+        <w:ind w:left="260" w:hanging="260"/>
+      </w:pPr>
+      <w:r>
+        <w:rPr>
+          <w:sz w:val="22"/>
+          <w:szCs w:val="22"/>
+        </w:rPr>
+        <w:t xml:space="preserve">✅ </w:t>
+      </w:r>
+      <w:r>
+        <w:rPr>
+          <w:b/>
+          <w:bCs/>
+          <w:color w:val="059669"/>
+          <w:sz w:val="22"/>
+          <w:szCs w:val="22"/>
+        </w:rPr>
+        <w:t xml:space="preserve">Worker ledger credited: $289.50.</w:t>
       </w:r>
     </w:p>
     <w:p>
@@ -6476,30 +6476,30 @@
           <w:sz w:val="22"/>
           <w:szCs w:val="22"/>
         </w:rPr>
-        <w:t xml:space="preserve">GMV: $300, Fee: $21, Rebate: $20, Net earnings: $299.</w:t>
-      </w:r>
-    </w:p>
-    <w:p>
-      <w:pPr>
-        <w:spacing w:after="60" w:line="290"/>
-        <w:ind w:left="260" w:hanging="260"/>
-      </w:pPr>
-      <w:r>
-        <w:rPr>
-          <w:sz w:val="22"/>
-          <w:szCs w:val="22"/>
-        </w:rPr>
-        <w:t xml:space="preserve">✅ </w:t>
-      </w:r>
-      <w:r>
-        <w:rPr>
-          <w:b/>
-          <w:bCs/>
-          <w:color w:val="059669"/>
-          <w:sz w:val="22"/>
-          <w:szCs w:val="22"/>
-        </w:rPr>
-        <w:t xml:space="preserve">Payout: $200, Net balance: $99.</w:t>
+        <w:t xml:space="preserve">GMV: $300, Fee: $21, Rebate: $10.50, Net earnings: $289.50.</w:t>
+      </w:r>
+    </w:p>
+    <w:p>
+      <w:pPr>
+        <w:spacing w:after="60" w:line="290"/>
+        <w:ind w:left="260" w:hanging="260"/>
+      </w:pPr>
+      <w:r>
+        <w:rPr>
+          <w:sz w:val="22"/>
+          <w:szCs w:val="22"/>
+        </w:rPr>
+        <w:t xml:space="preserve">✅ </w:t>
+      </w:r>
+      <w:r>
+        <w:rPr>
+          <w:b/>
+          <w:bCs/>
+          <w:color w:val="059669"/>
+          <w:sz w:val="22"/>
+          <w:szCs w:val="22"/>
+        </w:rPr>
+        <w:t xml:space="preserve">Payout: $200, Net balance: $89.50.</w:t>
       </w:r>
     </w:p>
     <w:p>
@@ -6646,7 +6646,7 @@
           <w:sz w:val="22"/>
           <w:szCs w:val="22"/>
         </w:rPr>
-        <w:t xml:space="preserve">Fee Rules panel shows the current take rate (7%, $5 floor, $300 cap).</w:t>
+        <w:t xml:space="preserve">Fee Rules panel shows the plan ladder (12/9/7/5/4%, $5 floor, $300 cap).</w:t>
       </w:r>
     </w:p>
     <w:p>
@@ -7908,7 +7908,7 @@
                 <w:sz w:val="19"/>
                 <w:szCs w:val="19"/>
               </w:rPr>
-              <w:t xml:space="preserve">Per-booking (7%, Business 4%, $5–$300)</w:t>
+              <w:t xml:space="preserve">Per-booking (ladder 12/9/7/5/4%, $5–$300)</w:t>
             </w:r>
           </w:p>
         </w:tc>

</xml_diff>